<commit_message>
Add skill-para-procedimientos + PCD1 corregido (portada, headers, contenido completo)
</commit_message>
<xml_diff>
--- a/workspaces/instructivos/PCD1_PROCEDIMIENTO_DE_SEGUIMIENTO_A_COBRANZA_ATRASADA.docx
+++ b/workspaces/instructivos/PCD1_PROCEDIMIENTO_DE_SEGUIMIENTO_A_COBRANZA_ATRASADA.docx
@@ -463,7 +463,7 @@
                   <w:sz w:val="28"/>
                   <w:szCs w:val="28"/>
                 </w:rPr>
-                <w:t>PROCEDIMIENTO EN BLANCO</w:t>
+                <w:t>PROCEDIMIENTO DE SEGUIMIENTO A COBRANZA ATRASADA</w:t>
               </w:r>
             </w:p>
           </w:sdtContent>
@@ -680,7 +680,12 @@
     </w:p>
     <w:p>
       <w:r>
-        <w:t>Reporte interno de cartera vencida/atrasada y registro de seguimiento (observaciones/bitácora).</w:t>
+        <w:t>Archivo Pagos_V3 (hoja VENCIDAS) — D:\pagos\</w:t>
+      </w:r>
+    </w:p>
+    <w:p>
+      <w:r>
+        <w:t>Registro de observaciones y avisos de visita en Google Sheets.</w:t>
       </w:r>
     </w:p>
     <w:p>
@@ -721,6 +726,11 @@
     <w:p>
       <w:r>
         <w:t>Evidencia de pago: comprobante/captura validada conforme a proceso interno.</w:t>
+      </w:r>
+    </w:p>
+    <w:p>
+      <w:r>
+        <w:t>Aviso de visita: notificación de paso del cobrador sin localizar al cliente.</w:t>
       </w:r>
     </w:p>
     <w:p>
@@ -1207,9 +1217,6 @@
           <w:r>
             <w:t>: 25/10/2025</w:t>
           </w:r>
-          <w:r>
-            <w:t>5</w:t>
-          </w:r>
         </w:p>
       </w:tc>
       <w:tc>
@@ -1262,6 +1269,15 @@
             <w:pStyle w:val="Encabezado"/>
             <w:jc w:val="center"/>
           </w:pPr>
+          <w:r>
+            <w:rPr>
+              <w:b/>
+              <w:bCs/>
+              <w:sz w:val="24"/>
+              <w:szCs w:val="24"/>
+            </w:rPr>
+            <w:t>PCD1</w:t>
+          </w:r>
         </w:p>
       </w:tc>
       <w:tc>
@@ -1313,6 +1329,15 @@
             <w:pStyle w:val="Encabezado"/>
             <w:jc w:val="center"/>
           </w:pPr>
+          <w:r>
+            <w:rPr>
+              <w:b/>
+              <w:bCs/>
+              <w:sz w:val="24"/>
+              <w:szCs w:val="24"/>
+            </w:rPr>
+            <w:t>Cobranza</w:t>
+          </w:r>
         </w:p>
       </w:tc>
     </w:tr>

</xml_diff>